<commit_message>
Genel ayarlar, Excel aktarım ve arayüz iyileştirmeleri güncellendi
</commit_message>
<xml_diff>
--- a/app/static/templates/Sozlesme_TASLAK.docx
+++ b/app/static/templates/Sozlesme_TASLAK.docx
@@ -1190,32 +1190,39 @@
           <w:rFonts w:ascii="Times New Roman" w:hAnsi="Times New Roman" w:cs="Times New Roman"/>
           <w:sz w:val="24"/>
         </w:rPr>
+        <w:t>VEREN’in</w:t>
+      </w:r>
+      <w:proofErr w:type="spellEnd"/>
+      <w:r>
+        <w:rPr>
+          <w:rFonts w:ascii="Times New Roman" w:hAnsi="Times New Roman" w:cs="Times New Roman"/>
+          <w:sz w:val="24"/>
+        </w:rPr>
+        <w:t xml:space="preserve"> tesisinde veya isteyeceği adreste iade edecektir. Aksi takdirde KİRACI, MAKİNE/</w:t>
+      </w:r>
+      <w:proofErr w:type="spellStart"/>
+      <w:r>
+        <w:rPr>
+          <w:rFonts w:ascii="Times New Roman" w:hAnsi="Times New Roman" w:cs="Times New Roman"/>
+          <w:sz w:val="24"/>
+        </w:rPr>
+        <w:t>MAKİNELER’in</w:t>
+      </w:r>
+      <w:proofErr w:type="spellEnd"/>
+      <w:r>
+        <w:rPr>
+          <w:rFonts w:ascii="Times New Roman" w:hAnsi="Times New Roman" w:cs="Times New Roman"/>
+          <w:sz w:val="24"/>
+        </w:rPr>
+        <w:t xml:space="preserve"> masrafların kendisine ait olmak üzere bulunduğu yerden KİRAYA VEREN tarafından el koyularak teslim </w:t>
+      </w:r>
+      <w:r>
+        <w:rPr>
+          <w:rFonts w:ascii="Times New Roman" w:hAnsi="Times New Roman" w:cs="Times New Roman"/>
+          <w:sz w:val="24"/>
+        </w:rPr>
         <w:lastRenderedPageBreak/>
-        <w:t>VEREN’in</w:t>
-      </w:r>
-      <w:proofErr w:type="spellEnd"/>
-      <w:r>
-        <w:rPr>
-          <w:rFonts w:ascii="Times New Roman" w:hAnsi="Times New Roman" w:cs="Times New Roman"/>
-          <w:sz w:val="24"/>
-        </w:rPr>
-        <w:t xml:space="preserve"> tesisinde veya isteyeceği adreste iade edecektir. Aksi takdirde KİRACI, MAKİNE/</w:t>
-      </w:r>
-      <w:proofErr w:type="spellStart"/>
-      <w:r>
-        <w:rPr>
-          <w:rFonts w:ascii="Times New Roman" w:hAnsi="Times New Roman" w:cs="Times New Roman"/>
-          <w:sz w:val="24"/>
-        </w:rPr>
-        <w:t>MAKİNELER’in</w:t>
-      </w:r>
-      <w:proofErr w:type="spellEnd"/>
-      <w:r>
-        <w:rPr>
-          <w:rFonts w:ascii="Times New Roman" w:hAnsi="Times New Roman" w:cs="Times New Roman"/>
-          <w:sz w:val="24"/>
-        </w:rPr>
-        <w:t xml:space="preserve"> masrafların kendisine ait olmak üzere bulunduğu yerden KİRAYA VEREN tarafından el koyularak teslim alınabileceği hususunu ve KİRAYA VEREN’ in MAKİNE/</w:t>
+        <w:t>alınabileceği hususunu ve KİRAYA VEREN’ in MAKİNE/</w:t>
       </w:r>
       <w:proofErr w:type="spellStart"/>
       <w:r>
@@ -1986,7 +1993,87 @@
           <w:rFonts w:ascii="Times New Roman" w:hAnsi="Times New Roman" w:cs="Times New Roman"/>
           <w:sz w:val="24"/>
         </w:rPr>
-        <w:t xml:space="preserve"> kira bedeli ve diğer hizmet bedelleri mutabık kalınan vadeleriyle birlikte kiralama formunda (EK-1) belirtilmiştir. Ödemeler Euro olarak aynen ödenebileceği gibi ödeme tarihindeki T.C.M.B. döviz satış kuru karşılığı olan TL cinsinden de ödenebilir. Ödemelerin gününde yapılmaması halinde, </w:t>
+        <w:t xml:space="preserve"> kira bedeli ve diğer hizmet bedelleri mutabık kalınan vadeleriyle birlikte kiralama formunda (EK-1) belirtilmiştir. Ödemeler Euro olarak aynen ödenebileceği gibi ödeme tarihindeki T.C.M.B. döviz satış kuru karşılığı olan TL cinsinden de ödenebilir. Ödemelerin gününde yapılmaması halinde, Ek-1’ de belirlenen vade tarihinden itibaren fiili ödeme tarihine kadar EURO bazında aylık </w:t>
+      </w:r>
+      <w:proofErr w:type="gramStart"/>
+      <w:r>
+        <w:rPr>
+          <w:rFonts w:ascii="Times New Roman" w:hAnsi="Times New Roman" w:cs="Times New Roman"/>
+          <w:sz w:val="24"/>
+        </w:rPr>
+        <w:t>% 1</w:t>
+      </w:r>
+      <w:proofErr w:type="gramEnd"/>
+      <w:r>
+        <w:rPr>
+          <w:rFonts w:ascii="Times New Roman" w:hAnsi="Times New Roman" w:cs="Times New Roman"/>
+          <w:sz w:val="24"/>
+        </w:rPr>
+        <w:t xml:space="preserve"> veya Türk </w:t>
+      </w:r>
+      <w:proofErr w:type="gramStart"/>
+      <w:r>
+        <w:rPr>
+          <w:rFonts w:ascii="Times New Roman" w:hAnsi="Times New Roman" w:cs="Times New Roman"/>
+          <w:sz w:val="24"/>
+        </w:rPr>
+        <w:t>Lirası</w:t>
+      </w:r>
+      <w:proofErr w:type="gramEnd"/>
+      <w:r>
+        <w:rPr>
+          <w:rFonts w:ascii="Times New Roman" w:hAnsi="Times New Roman" w:cs="Times New Roman"/>
+          <w:sz w:val="24"/>
+        </w:rPr>
+        <w:t xml:space="preserve"> bazında aylık %3 gecikme faizi uygulanacaktır. Herhangi bir ödemenin gününde yapılmaması, kalan borçları ihtara gerek kalmaksızın muaccel hale getirecektir. Bu durumda KİRAYA </w:t>
+      </w:r>
+      <w:proofErr w:type="spellStart"/>
+      <w:r>
+        <w:rPr>
+          <w:rFonts w:ascii="Times New Roman" w:hAnsi="Times New Roman" w:cs="Times New Roman"/>
+          <w:sz w:val="24"/>
+        </w:rPr>
+        <w:t>VEREN’in</w:t>
+      </w:r>
+      <w:proofErr w:type="spellEnd"/>
+      <w:r>
+        <w:rPr>
+          <w:rFonts w:ascii="Times New Roman" w:hAnsi="Times New Roman" w:cs="Times New Roman"/>
+          <w:sz w:val="24"/>
+        </w:rPr>
+        <w:t xml:space="preserve"> MAKİNE/</w:t>
+      </w:r>
+      <w:proofErr w:type="spellStart"/>
+      <w:r>
+        <w:rPr>
+          <w:rFonts w:ascii="Times New Roman" w:hAnsi="Times New Roman" w:cs="Times New Roman"/>
+          <w:sz w:val="24"/>
+        </w:rPr>
+        <w:t>MAKİNELER’in</w:t>
+      </w:r>
+      <w:proofErr w:type="spellEnd"/>
+      <w:r>
+        <w:rPr>
+          <w:rFonts w:ascii="Times New Roman" w:hAnsi="Times New Roman" w:cs="Times New Roman"/>
+          <w:sz w:val="24"/>
+        </w:rPr>
+        <w:t xml:space="preserve"> iadesini talep etmesi durumunda KİRACI MAKİNE/</w:t>
+      </w:r>
+      <w:proofErr w:type="spellStart"/>
+      <w:r>
+        <w:rPr>
+          <w:rFonts w:ascii="Times New Roman" w:hAnsi="Times New Roman" w:cs="Times New Roman"/>
+          <w:sz w:val="24"/>
+        </w:rPr>
+        <w:t>MAKİNELER’i</w:t>
+      </w:r>
+      <w:proofErr w:type="spellEnd"/>
+      <w:r>
+        <w:rPr>
+          <w:rFonts w:ascii="Times New Roman" w:hAnsi="Times New Roman" w:cs="Times New Roman"/>
+          <w:sz w:val="24"/>
+        </w:rPr>
+        <w:t xml:space="preserve"> derhal iade </w:t>
       </w:r>
       <w:r>
         <w:rPr>
@@ -1994,87 +2081,7 @@
           <w:sz w:val="24"/>
         </w:rPr>
         <w:lastRenderedPageBreak/>
-        <w:t xml:space="preserve">Ek-1’ de belirlenen vade tarihinden itibaren fiili ödeme tarihine kadar EURO bazında aylık </w:t>
-      </w:r>
-      <w:proofErr w:type="gramStart"/>
-      <w:r>
-        <w:rPr>
-          <w:rFonts w:ascii="Times New Roman" w:hAnsi="Times New Roman" w:cs="Times New Roman"/>
-          <w:sz w:val="24"/>
-        </w:rPr>
-        <w:t>% 1</w:t>
-      </w:r>
-      <w:proofErr w:type="gramEnd"/>
-      <w:r>
-        <w:rPr>
-          <w:rFonts w:ascii="Times New Roman" w:hAnsi="Times New Roman" w:cs="Times New Roman"/>
-          <w:sz w:val="24"/>
-        </w:rPr>
-        <w:t xml:space="preserve"> veya Türk </w:t>
-      </w:r>
-      <w:proofErr w:type="gramStart"/>
-      <w:r>
-        <w:rPr>
-          <w:rFonts w:ascii="Times New Roman" w:hAnsi="Times New Roman" w:cs="Times New Roman"/>
-          <w:sz w:val="24"/>
-        </w:rPr>
-        <w:t>Lirası</w:t>
-      </w:r>
-      <w:proofErr w:type="gramEnd"/>
-      <w:r>
-        <w:rPr>
-          <w:rFonts w:ascii="Times New Roman" w:hAnsi="Times New Roman" w:cs="Times New Roman"/>
-          <w:sz w:val="24"/>
-        </w:rPr>
-        <w:t xml:space="preserve"> bazında aylık %3 gecikme faizi uygulanacaktır. Herhangi bir ödemenin gününde yapılmaması, kalan borçları ihtara gerek kalmaksızın muaccel hale getirecektir. Bu durumda KİRAYA </w:t>
-      </w:r>
-      <w:proofErr w:type="spellStart"/>
-      <w:r>
-        <w:rPr>
-          <w:rFonts w:ascii="Times New Roman" w:hAnsi="Times New Roman" w:cs="Times New Roman"/>
-          <w:sz w:val="24"/>
-        </w:rPr>
-        <w:t>VEREN’in</w:t>
-      </w:r>
-      <w:proofErr w:type="spellEnd"/>
-      <w:r>
-        <w:rPr>
-          <w:rFonts w:ascii="Times New Roman" w:hAnsi="Times New Roman" w:cs="Times New Roman"/>
-          <w:sz w:val="24"/>
-        </w:rPr>
-        <w:t xml:space="preserve"> MAKİNE/</w:t>
-      </w:r>
-      <w:proofErr w:type="spellStart"/>
-      <w:r>
-        <w:rPr>
-          <w:rFonts w:ascii="Times New Roman" w:hAnsi="Times New Roman" w:cs="Times New Roman"/>
-          <w:sz w:val="24"/>
-        </w:rPr>
-        <w:t>MAKİNELER’in</w:t>
-      </w:r>
-      <w:proofErr w:type="spellEnd"/>
-      <w:r>
-        <w:rPr>
-          <w:rFonts w:ascii="Times New Roman" w:hAnsi="Times New Roman" w:cs="Times New Roman"/>
-          <w:sz w:val="24"/>
-        </w:rPr>
-        <w:t xml:space="preserve"> iadesini talep etmesi durumunda KİRACI MAKİNE/</w:t>
-      </w:r>
-      <w:proofErr w:type="spellStart"/>
-      <w:r>
-        <w:rPr>
-          <w:rFonts w:ascii="Times New Roman" w:hAnsi="Times New Roman" w:cs="Times New Roman"/>
-          <w:sz w:val="24"/>
-        </w:rPr>
-        <w:t>MAKİNELER’i</w:t>
-      </w:r>
-      <w:proofErr w:type="spellEnd"/>
-      <w:r>
-        <w:rPr>
-          <w:rFonts w:ascii="Times New Roman" w:hAnsi="Times New Roman" w:cs="Times New Roman"/>
-          <w:sz w:val="24"/>
-        </w:rPr>
-        <w:t xml:space="preserve"> derhal iade edeceğini kabul ve taahhüt eder. Nakliye, operatör ve diğer yükümlülükler </w:t>
+        <w:t xml:space="preserve">edeceğini kabul ve taahhüt eder. Nakliye, operatör ve diğer yükümlülükler </w:t>
       </w:r>
       <w:proofErr w:type="spellStart"/>
       <w:r>
@@ -2802,7 +2809,6 @@
           <w:rFonts w:ascii="Times New Roman" w:hAnsi="Times New Roman" w:cs="Times New Roman"/>
           <w:sz w:val="24"/>
         </w:rPr>
-        <w:lastRenderedPageBreak/>
         <w:t>9.2</w:t>
       </w:r>
       <w:r>
@@ -2843,7 +2849,15 @@
           <w:rFonts w:ascii="Times New Roman" w:hAnsi="Times New Roman" w:cs="Times New Roman"/>
           <w:sz w:val="24"/>
         </w:rPr>
-        <w:t xml:space="preserve"> yükümlülüğündedir. Yangın, sabotaj ve benzeri nedenlerden dolayı doğabilecek zararlara karşı KİRACI, işyerinde gerekli mali sorumluluk sigortalarını yaptırmakla ve kiralamış olduğu MAKİNE/MAKİNELERİ zeyilname düzenleterek poliçe kapsamına aldırmakla yükümlüdür. MAKİNE/</w:t>
+        <w:t xml:space="preserve"> yükümlülüğündedir. Yangın, sabotaj ve benzeri nedenlerden dolayı doğabilecek zararlara karşı KİRACI, işyerinde gerekli mali sorumluluk sigortalarını yaptırmakla ve kiralamış olduğu MAKİNE/MAKİNELERİ zeyilname düzenleterek poliçe </w:t>
+      </w:r>
+      <w:r>
+        <w:rPr>
+          <w:rFonts w:ascii="Times New Roman" w:hAnsi="Times New Roman" w:cs="Times New Roman"/>
+          <w:sz w:val="24"/>
+        </w:rPr>
+        <w:lastRenderedPageBreak/>
+        <w:t>kapsamına aldırmakla yükümlüdür. MAKİNE/</w:t>
       </w:r>
       <w:proofErr w:type="spellStart"/>
       <w:r>
@@ -3555,15 +3569,7 @@
           <w:rFonts w:ascii="Times New Roman" w:hAnsi="Times New Roman" w:cs="Times New Roman"/>
           <w:sz w:val="24"/>
         </w:rPr>
-        <w:t xml:space="preserve"> </w:t>
-      </w:r>
-      <w:r>
-        <w:rPr>
-          <w:rFonts w:ascii="Times New Roman" w:hAnsi="Times New Roman" w:cs="Times New Roman"/>
-          <w:sz w:val="24"/>
-        </w:rPr>
-        <w:lastRenderedPageBreak/>
-        <w:t>kullanıl</w:t>
+        <w:t xml:space="preserve"> kullanıl</w:t>
       </w:r>
       <w:r>
         <w:rPr>
@@ -3772,6 +3778,7 @@
           <w:rFonts w:ascii="Times New Roman" w:hAnsi="Times New Roman" w:cs="Times New Roman"/>
           <w:sz w:val="24"/>
         </w:rPr>
+        <w:lastRenderedPageBreak/>
         <w:t>9.1</w:t>
       </w:r>
       <w:r>
@@ -4489,15 +4496,7 @@
           <w:rFonts w:ascii="Times New Roman" w:hAnsi="Times New Roman" w:cs="Times New Roman"/>
           <w:sz w:val="24"/>
         </w:rPr>
-        <w:t xml:space="preserve"> fatura edecektir. KİRACI, bu bedeli faturanın </w:t>
-      </w:r>
-      <w:r>
-        <w:rPr>
-          <w:rFonts w:ascii="Times New Roman" w:hAnsi="Times New Roman" w:cs="Times New Roman"/>
-          <w:sz w:val="24"/>
-        </w:rPr>
-        <w:lastRenderedPageBreak/>
-        <w:t>kendisine tebliğ edildiği tarihten itibaren 7 (yedi) gün içerisinde KİRAYA VEREN’ e nakden ve defaten ödemeyi ka</w:t>
+        <w:t xml:space="preserve"> fatura edecektir. KİRACI, bu bedeli faturanın kendisine tebliğ edildiği tarihten itibaren 7 (yedi) gün içerisinde KİRAYA VEREN’ e nakden ve defaten ödemeyi ka</w:t>
       </w:r>
       <w:r>
         <w:rPr>
@@ -4676,7 +4675,15 @@
           <w:rFonts w:ascii="Times New Roman" w:hAnsi="Times New Roman" w:cs="Times New Roman"/>
           <w:sz w:val="24"/>
         </w:rPr>
-        <w:t>, birden fazla aracın karıştığı kazalarda kazaya karışan tüm MAKİNE/</w:t>
+        <w:t xml:space="preserve">, birden fazla aracın </w:t>
+      </w:r>
+      <w:r>
+        <w:rPr>
+          <w:rFonts w:ascii="Times New Roman" w:hAnsi="Times New Roman" w:cs="Times New Roman"/>
+          <w:sz w:val="24"/>
+        </w:rPr>
+        <w:lastRenderedPageBreak/>
+        <w:t>karıştığı kazalarda kazaya karışan tüm MAKİNE/</w:t>
       </w:r>
       <w:proofErr w:type="spellStart"/>
       <w:r>
@@ -5220,15 +5227,7 @@
           <w:rFonts w:ascii="Times New Roman" w:hAnsi="Times New Roman" w:cs="Times New Roman"/>
           <w:sz w:val="24"/>
         </w:rPr>
-        <w:t xml:space="preserve"> işbu sözleşmeden kaynaklı </w:t>
-      </w:r>
-      <w:r>
-        <w:rPr>
-          <w:rFonts w:ascii="Times New Roman" w:hAnsi="Times New Roman" w:cs="Times New Roman"/>
-          <w:sz w:val="24"/>
-        </w:rPr>
-        <w:lastRenderedPageBreak/>
-        <w:t xml:space="preserve">yükümlülüklerini yerine getirmesine engel teşkil etmeyeceği gibi </w:t>
+        <w:t xml:space="preserve"> işbu sözleşmeden kaynaklı yükümlülüklerini yerine getirmesine engel teşkil etmeyeceği gibi </w:t>
       </w:r>
       <w:proofErr w:type="spellStart"/>
       <w:r>
@@ -5439,6 +5438,7 @@
           <w:rFonts w:ascii="Times New Roman" w:hAnsi="Times New Roman" w:cs="Times New Roman"/>
           <w:sz w:val="24"/>
         </w:rPr>
+        <w:lastRenderedPageBreak/>
         <w:t>12.5</w:t>
       </w:r>
       <w:r>
@@ -5876,7 +5876,6 @@
           <w:b/>
           <w:sz w:val="24"/>
         </w:rPr>
-        <w:lastRenderedPageBreak/>
         <w:t>Madde-16: Anlaşmazlık Halli-Yetkili Mahkeme</w:t>
       </w:r>
     </w:p>
@@ -6098,6 +6097,7 @@
           <w:rFonts w:ascii="Times New Roman" w:hAnsi="Times New Roman" w:cs="Times New Roman"/>
           <w:sz w:val="24"/>
         </w:rPr>
+        <w:lastRenderedPageBreak/>
         <w:t>17.2</w:t>
       </w:r>
       <w:r>
@@ -6356,16 +6356,16 @@
         <mc:AlternateContent>
           <mc:Choice Requires="wps">
             <w:drawing>
-              <wp:anchor distT="0" distB="0" distL="114300" distR="114300" simplePos="0" relativeHeight="251658240" behindDoc="0" locked="0" layoutInCell="1" allowOverlap="1" wp14:anchorId="41EE5355" wp14:editId="5C7A0971">
+              <wp:anchor distT="0" distB="0" distL="114300" distR="114300" simplePos="0" relativeHeight="251658240" behindDoc="0" locked="0" layoutInCell="1" allowOverlap="1" wp14:anchorId="41EE5355" wp14:editId="4E96DF52">
                 <wp:simplePos x="0" y="0"/>
                 <wp:positionH relativeFrom="column">
-                  <wp:posOffset>5017135</wp:posOffset>
+                  <wp:posOffset>4966335</wp:posOffset>
                 </wp:positionH>
                 <wp:positionV relativeFrom="paragraph">
-                  <wp:posOffset>316230</wp:posOffset>
+                  <wp:posOffset>323850</wp:posOffset>
                 </wp:positionV>
-                <wp:extent cx="1861185" cy="1225550"/>
-                <wp:effectExtent l="0" t="0" r="5715" b="12700"/>
+                <wp:extent cx="1593850" cy="1225550"/>
+                <wp:effectExtent l="0" t="0" r="6350" b="12700"/>
                 <wp:wrapNone/>
                 <wp:docPr id="15" name="Text Box 6"/>
                 <wp:cNvGraphicFramePr>
@@ -6380,7 +6380,7 @@
                       <wps:spPr bwMode="auto">
                         <a:xfrm>
                           <a:off x="0" y="0"/>
-                          <a:ext cx="1861185" cy="1225550"/>
+                          <a:ext cx="1593850" cy="1225550"/>
                         </a:xfrm>
                         <a:prstGeom prst="rect">
                           <a:avLst/>
@@ -6414,24 +6414,73 @@
                           <w:p>
                             <w:pPr>
                               <w:spacing w:after="0" w:line="240" w:lineRule="auto"/>
+                              <w:jc w:val="center"/>
                               <w:rPr>
                                 <w:rFonts w:ascii="Times New Roman" w:hAnsi="Times New Roman" w:cs="Times New Roman"/>
+                                <w:b/>
+                                <w:bCs/>
                                 <w:sz w:val="24"/>
                               </w:rPr>
                             </w:pPr>
+                            <w:proofErr w:type="gramStart"/>
                             <w:r>
                               <w:rPr>
                                 <w:rFonts w:ascii="Times New Roman" w:hAnsi="Times New Roman" w:cs="Times New Roman"/>
+                                <w:b/>
+                                <w:bCs/>
                                 <w:sz w:val="24"/>
                               </w:rPr>
-                              <w:t xml:space="preserve">   </w:t>
+                              <w:t xml:space="preserve">{{ </w:t>
                             </w:r>
+                            <w:proofErr w:type="spellStart"/>
                             <w:r>
                               <w:rPr>
                                 <w:rFonts w:ascii="Times New Roman" w:hAnsi="Times New Roman" w:cs="Times New Roman"/>
+                                <w:b/>
+                                <w:bCs/>
                                 <w:sz w:val="24"/>
                               </w:rPr>
-                              <w:t>{{ firma_adi }}</w:t>
+                              <w:t>firma</w:t>
+                            </w:r>
+                            <w:proofErr w:type="gramEnd"/>
+                            <w:r>
+                              <w:rPr>
+                                <w:rFonts w:ascii="Times New Roman" w:hAnsi="Times New Roman" w:cs="Times New Roman"/>
+                                <w:b/>
+                                <w:bCs/>
+                                <w:sz w:val="24"/>
+                              </w:rPr>
+                              <w:t>_</w:t>
+                            </w:r>
+                            <w:proofErr w:type="gramStart"/>
+                            <w:r>
+                              <w:rPr>
+                                <w:rFonts w:ascii="Times New Roman" w:hAnsi="Times New Roman" w:cs="Times New Roman"/>
+                                <w:b/>
+                                <w:bCs/>
+                                <w:sz w:val="24"/>
+                              </w:rPr>
+                              <w:t>adi</w:t>
+                            </w:r>
+                            <w:proofErr w:type="spellEnd"/>
+                            <w:r>
+                              <w:rPr>
+                                <w:rFonts w:ascii="Times New Roman" w:hAnsi="Times New Roman" w:cs="Times New Roman"/>
+                                <w:b/>
+                                <w:bCs/>
+                                <w:sz w:val="24"/>
+                              </w:rPr>
+                              <w:t xml:space="preserve"> }</w:t>
+                            </w:r>
+                            <w:proofErr w:type="gramEnd"/>
+                            <w:r>
+                              <w:rPr>
+                                <w:rFonts w:ascii="Times New Roman" w:hAnsi="Times New Roman" w:cs="Times New Roman"/>
+                                <w:b/>
+                                <w:bCs/>
+                                <w:sz w:val="24"/>
+                              </w:rPr>
+                              <w:t>}</w:t>
                             </w:r>
                           </w:p>
                         </w:txbxContent>
@@ -6457,30 +6506,79 @@
                 <v:stroke joinstyle="miter"/>
                 <v:path gradientshapeok="t" o:connecttype="rect"/>
               </v:shapetype>
-              <v:shape id="Text Box 6" o:spid="_x0000_s1026" type="#_x0000_t202" style="position:absolute;left:0;text-align:left;margin-left:395.05pt;margin-top:24.9pt;width:146.55pt;height:96.5pt;z-index:251658240;visibility:visible;mso-wrap-style:square;mso-width-percent:0;mso-height-percent:0;mso-wrap-distance-left:9pt;mso-wrap-distance-top:0;mso-wrap-distance-right:9pt;mso-wrap-distance-bottom:0;mso-position-horizontal:absolute;mso-position-horizontal-relative:text;mso-position-vertical:absolute;mso-position-vertical-relative:text;mso-width-percent:0;mso-height-percent:0;mso-width-relative:margin;mso-height-relative:margin;v-text-anchor:top" o:gfxdata="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" filled="f" stroked="f">
+              <v:shape id="Text Box 6" o:spid="_x0000_s1026" type="#_x0000_t202" style="position:absolute;left:0;text-align:left;margin-left:391.05pt;margin-top:25.5pt;width:125.5pt;height:96.5pt;z-index:251658240;visibility:visible;mso-wrap-style:square;mso-width-percent:0;mso-height-percent:0;mso-wrap-distance-left:9pt;mso-wrap-distance-top:0;mso-wrap-distance-right:9pt;mso-wrap-distance-bottom:0;mso-position-horizontal:absolute;mso-position-horizontal-relative:text;mso-position-vertical:absolute;mso-position-vertical-relative:text;mso-width-percent:0;mso-height-percent:0;mso-width-relative:margin;mso-height-relative:margin;v-text-anchor:top" o:gfxdata="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" filled="f" stroked="f">
                 <v:textbox inset="0,0,0,0">
                   <w:txbxContent>
                     <w:p>
                       <w:pPr>
                         <w:spacing w:after="0" w:line="240" w:lineRule="auto"/>
+                        <w:jc w:val="center"/>
                         <w:rPr>
                           <w:rFonts w:ascii="Times New Roman" w:hAnsi="Times New Roman" w:cs="Times New Roman"/>
+                          <w:b/>
+                          <w:bCs/>
                           <w:sz w:val="24"/>
                         </w:rPr>
                       </w:pPr>
+                      <w:proofErr w:type="gramStart"/>
                       <w:r>
                         <w:rPr>
                           <w:rFonts w:ascii="Times New Roman" w:hAnsi="Times New Roman" w:cs="Times New Roman"/>
+                          <w:b/>
+                          <w:bCs/>
                           <w:sz w:val="24"/>
                         </w:rPr>
-                        <w:t xml:space="preserve">   </w:t>
+                        <w:t xml:space="preserve">{{ </w:t>
                       </w:r>
+                      <w:proofErr w:type="spellStart"/>
                       <w:r>
                         <w:rPr>
                           <w:rFonts w:ascii="Times New Roman" w:hAnsi="Times New Roman" w:cs="Times New Roman"/>
+                          <w:b/>
+                          <w:bCs/>
                           <w:sz w:val="24"/>
                         </w:rPr>
-                        <w:t>{{ firma_adi }}</w:t>
+                        <w:t>firma</w:t>
+                      </w:r>
+                      <w:proofErr w:type="gramEnd"/>
+                      <w:r>
+                        <w:rPr>
+                          <w:rFonts w:ascii="Times New Roman" w:hAnsi="Times New Roman" w:cs="Times New Roman"/>
+                          <w:b/>
+                          <w:bCs/>
+                          <w:sz w:val="24"/>
+                        </w:rPr>
+                        <w:t>_</w:t>
+                      </w:r>
+                      <w:proofErr w:type="gramStart"/>
+                      <w:r>
+                        <w:rPr>
+                          <w:rFonts w:ascii="Times New Roman" w:hAnsi="Times New Roman" w:cs="Times New Roman"/>
+                          <w:b/>
+                          <w:bCs/>
+                          <w:sz w:val="24"/>
+                        </w:rPr>
+                        <w:t>adi</w:t>
+                      </w:r>
+                      <w:proofErr w:type="spellEnd"/>
+                      <w:r>
+                        <w:rPr>
+                          <w:rFonts w:ascii="Times New Roman" w:hAnsi="Times New Roman" w:cs="Times New Roman"/>
+                          <w:b/>
+                          <w:bCs/>
+                          <w:sz w:val="24"/>
+                        </w:rPr>
+                        <w:t xml:space="preserve"> }</w:t>
+                      </w:r>
+                      <w:proofErr w:type="gramEnd"/>
+                      <w:r>
+                        <w:rPr>
+                          <w:rFonts w:ascii="Times New Roman" w:hAnsi="Times New Roman" w:cs="Times New Roman"/>
+                          <w:b/>
+                          <w:bCs/>
+                          <w:sz w:val="24"/>
+                        </w:rPr>
+                        <w:t>}</w:t>
                       </w:r>
                     </w:p>
                   </w:txbxContent>
@@ -7132,6 +7230,7 @@
                                   <w:sz w:val="24"/>
                                 </w:rPr>
                               </w:pPr>
+                              <w:proofErr w:type="gramStart"/>
                               <w:r>
                                 <w:rPr>
                                   <w:rFonts w:ascii="Times New Roman" w:hAnsi="Times New Roman" w:cs="Times New Roman"/>
@@ -7172,6 +7271,7 @@
                                 </w:rPr>
                                 <w:t>:</w:t>
                               </w:r>
+                              <w:proofErr w:type="gramEnd"/>
                             </w:p>
                             <w:p>
                               <w:pPr>
@@ -7187,7 +7287,25 @@
                                   <w:color w:val="211F1F"/>
                                   <w:sz w:val="24"/>
                                 </w:rPr>
-                                <w:t>EK-1 :Kiralama Formu</w:t>
+                                <w:t>EK-</w:t>
+                              </w:r>
+                              <w:proofErr w:type="gramStart"/>
+                              <w:r>
+                                <w:rPr>
+                                  <w:rFonts w:ascii="Times New Roman" w:hAnsi="Times New Roman" w:cs="Times New Roman"/>
+                                  <w:color w:val="211F1F"/>
+                                  <w:sz w:val="24"/>
+                                </w:rPr>
+                                <w:t>1 :Kiralama</w:t>
+                              </w:r>
+                              <w:proofErr w:type="gramEnd"/>
+                              <w:r>
+                                <w:rPr>
+                                  <w:rFonts w:ascii="Times New Roman" w:hAnsi="Times New Roman" w:cs="Times New Roman"/>
+                                  <w:color w:val="211F1F"/>
+                                  <w:sz w:val="24"/>
+                                </w:rPr>
+                                <w:t xml:space="preserve"> Formu</w:t>
                               </w:r>
                             </w:p>
                             <w:p>
@@ -7205,7 +7323,25 @@
                                   <w:color w:val="211F1F"/>
                                   <w:sz w:val="24"/>
                                 </w:rPr>
-                                <w:t>EK-2 :Nakliye Kabul Formu</w:t>
+                                <w:t>EK-</w:t>
+                              </w:r>
+                              <w:proofErr w:type="gramStart"/>
+                              <w:r>
+                                <w:rPr>
+                                  <w:rFonts w:ascii="Times New Roman" w:hAnsi="Times New Roman" w:cs="Times New Roman"/>
+                                  <w:color w:val="211F1F"/>
+                                  <w:sz w:val="24"/>
+                                </w:rPr>
+                                <w:t>2 :Nakliye</w:t>
+                              </w:r>
+                              <w:proofErr w:type="gramEnd"/>
+                              <w:r>
+                                <w:rPr>
+                                  <w:rFonts w:ascii="Times New Roman" w:hAnsi="Times New Roman" w:cs="Times New Roman"/>
+                                  <w:color w:val="211F1F"/>
+                                  <w:sz w:val="24"/>
+                                </w:rPr>
+                                <w:t xml:space="preserve"> Kabul Formu</w:t>
                               </w:r>
                               <w:r>
                                 <w:rPr>
@@ -7222,7 +7358,35 @@
                                   <w:color w:val="211F1F"/>
                                   <w:sz w:val="24"/>
                                 </w:rPr>
-                                <w:t>EK-3 :Imza Sirküleri</w:t>
+                                <w:t>EK-</w:t>
+                              </w:r>
+                              <w:proofErr w:type="gramStart"/>
+                              <w:r>
+                                <w:rPr>
+                                  <w:rFonts w:ascii="Times New Roman" w:hAnsi="Times New Roman" w:cs="Times New Roman"/>
+                                  <w:color w:val="211F1F"/>
+                                  <w:sz w:val="24"/>
+                                </w:rPr>
+                                <w:t>3 :</w:t>
+                              </w:r>
+                              <w:proofErr w:type="spellStart"/>
+                              <w:r>
+                                <w:rPr>
+                                  <w:rFonts w:ascii="Times New Roman" w:hAnsi="Times New Roman" w:cs="Times New Roman"/>
+                                  <w:color w:val="211F1F"/>
+                                  <w:sz w:val="24"/>
+                                </w:rPr>
+                                <w:t>Imza</w:t>
+                              </w:r>
+                              <w:proofErr w:type="spellEnd"/>
+                              <w:proofErr w:type="gramEnd"/>
+                              <w:r>
+                                <w:rPr>
+                                  <w:rFonts w:ascii="Times New Roman" w:hAnsi="Times New Roman" w:cs="Times New Roman"/>
+                                  <w:color w:val="211F1F"/>
+                                  <w:sz w:val="24"/>
+                                </w:rPr>
+                                <w:t xml:space="preserve"> Sirküleri</w:t>
                               </w:r>
                             </w:p>
                           </w:txbxContent>
@@ -7328,12 +7492,21 @@
                                   <w:sz w:val="24"/>
                                 </w:rPr>
                               </w:pPr>
+                              <w:proofErr w:type="gramStart"/>
                               <w:r>
                                 <w:rPr>
                                   <w:rFonts w:ascii="Times New Roman" w:hAnsi="Times New Roman" w:cs="Times New Roman"/>
                                   <w:sz w:val="24"/>
                                 </w:rPr>
-                                <w:t>{{ tarih }}</w:t>
+                                <w:t>{{ tarih</w:t>
+                              </w:r>
+                              <w:proofErr w:type="gramEnd"/>
+                              <w:r>
+                                <w:rPr>
+                                  <w:rFonts w:ascii="Times New Roman" w:hAnsi="Times New Roman" w:cs="Times New Roman"/>
+                                  <w:sz w:val="24"/>
+                                </w:rPr>
+                                <w:t xml:space="preserve"> }}</w:t>
                               </w:r>
                             </w:p>
                           </w:txbxContent>
@@ -7364,6 +7537,7 @@
                             <w:sz w:val="24"/>
                           </w:rPr>
                         </w:pPr>
+                        <w:proofErr w:type="gramStart"/>
                         <w:r>
                           <w:rPr>
                             <w:rFonts w:ascii="Times New Roman" w:hAnsi="Times New Roman" w:cs="Times New Roman"/>
@@ -7404,6 +7578,7 @@
                           </w:rPr>
                           <w:t>:</w:t>
                         </w:r>
+                        <w:proofErr w:type="gramEnd"/>
                       </w:p>
                       <w:p>
                         <w:pPr>
@@ -7419,7 +7594,25 @@
                             <w:color w:val="211F1F"/>
                             <w:sz w:val="24"/>
                           </w:rPr>
-                          <w:t>EK-1 :Kiralama Formu</w:t>
+                          <w:t>EK-</w:t>
+                        </w:r>
+                        <w:proofErr w:type="gramStart"/>
+                        <w:r>
+                          <w:rPr>
+                            <w:rFonts w:ascii="Times New Roman" w:hAnsi="Times New Roman" w:cs="Times New Roman"/>
+                            <w:color w:val="211F1F"/>
+                            <w:sz w:val="24"/>
+                          </w:rPr>
+                          <w:t>1 :Kiralama</w:t>
+                        </w:r>
+                        <w:proofErr w:type="gramEnd"/>
+                        <w:r>
+                          <w:rPr>
+                            <w:rFonts w:ascii="Times New Roman" w:hAnsi="Times New Roman" w:cs="Times New Roman"/>
+                            <w:color w:val="211F1F"/>
+                            <w:sz w:val="24"/>
+                          </w:rPr>
+                          <w:t xml:space="preserve"> Formu</w:t>
                         </w:r>
                       </w:p>
                       <w:p>
@@ -7437,7 +7630,25 @@
                             <w:color w:val="211F1F"/>
                             <w:sz w:val="24"/>
                           </w:rPr>
-                          <w:t>EK-2 :Nakliye Kabul Formu</w:t>
+                          <w:t>EK-</w:t>
+                        </w:r>
+                        <w:proofErr w:type="gramStart"/>
+                        <w:r>
+                          <w:rPr>
+                            <w:rFonts w:ascii="Times New Roman" w:hAnsi="Times New Roman" w:cs="Times New Roman"/>
+                            <w:color w:val="211F1F"/>
+                            <w:sz w:val="24"/>
+                          </w:rPr>
+                          <w:t>2 :Nakliye</w:t>
+                        </w:r>
+                        <w:proofErr w:type="gramEnd"/>
+                        <w:r>
+                          <w:rPr>
+                            <w:rFonts w:ascii="Times New Roman" w:hAnsi="Times New Roman" w:cs="Times New Roman"/>
+                            <w:color w:val="211F1F"/>
+                            <w:sz w:val="24"/>
+                          </w:rPr>
+                          <w:t xml:space="preserve"> Kabul Formu</w:t>
                         </w:r>
                         <w:r>
                           <w:rPr>
@@ -7454,7 +7665,35 @@
                             <w:color w:val="211F1F"/>
                             <w:sz w:val="24"/>
                           </w:rPr>
-                          <w:t>EK-3 :Imza Sirküleri</w:t>
+                          <w:t>EK-</w:t>
+                        </w:r>
+                        <w:proofErr w:type="gramStart"/>
+                        <w:r>
+                          <w:rPr>
+                            <w:rFonts w:ascii="Times New Roman" w:hAnsi="Times New Roman" w:cs="Times New Roman"/>
+                            <w:color w:val="211F1F"/>
+                            <w:sz w:val="24"/>
+                          </w:rPr>
+                          <w:t>3 :</w:t>
+                        </w:r>
+                        <w:proofErr w:type="spellStart"/>
+                        <w:r>
+                          <w:rPr>
+                            <w:rFonts w:ascii="Times New Roman" w:hAnsi="Times New Roman" w:cs="Times New Roman"/>
+                            <w:color w:val="211F1F"/>
+                            <w:sz w:val="24"/>
+                          </w:rPr>
+                          <w:t>Imza</w:t>
+                        </w:r>
+                        <w:proofErr w:type="spellEnd"/>
+                        <w:proofErr w:type="gramEnd"/>
+                        <w:r>
+                          <w:rPr>
+                            <w:rFonts w:ascii="Times New Roman" w:hAnsi="Times New Roman" w:cs="Times New Roman"/>
+                            <w:color w:val="211F1F"/>
+                            <w:sz w:val="24"/>
+                          </w:rPr>
+                          <w:t xml:space="preserve"> Sirküleri</w:t>
                         </w:r>
                       </w:p>
                     </w:txbxContent>
@@ -7521,12 +7760,21 @@
                             <w:sz w:val="24"/>
                           </w:rPr>
                         </w:pPr>
+                        <w:proofErr w:type="gramStart"/>
                         <w:r>
                           <w:rPr>
                             <w:rFonts w:ascii="Times New Roman" w:hAnsi="Times New Roman" w:cs="Times New Roman"/>
                             <w:sz w:val="24"/>
                           </w:rPr>
-                          <w:t>{{ tarih }}</w:t>
+                          <w:t>{{ tarih</w:t>
+                        </w:r>
+                        <w:proofErr w:type="gramEnd"/>
+                        <w:r>
+                          <w:rPr>
+                            <w:rFonts w:ascii="Times New Roman" w:hAnsi="Times New Roman" w:cs="Times New Roman"/>
+                            <w:sz w:val="24"/>
+                          </w:rPr>
+                          <w:t xml:space="preserve"> }}</w:t>
                         </w:r>
                       </w:p>
                     </w:txbxContent>
@@ -7540,8 +7788,12 @@
       </w:r>
     </w:p>
     <w:sectPr>
-      <w:headerReference w:type="default" r:id="rId7"/>
-      <w:footerReference w:type="default" r:id="rId8"/>
+      <w:headerReference w:type="even" r:id="rId7"/>
+      <w:headerReference w:type="default" r:id="rId8"/>
+      <w:footerReference w:type="even" r:id="rId9"/>
+      <w:footerReference w:type="default" r:id="rId10"/>
+      <w:headerReference w:type="first" r:id="rId11"/>
+      <w:footerReference w:type="first" r:id="rId12"/>
       <w:pgSz w:w="11906" w:h="16838"/>
       <w:pgMar w:top="1135" w:right="566" w:bottom="426" w:left="709" w:header="567" w:footer="737" w:gutter="0"/>
       <w:cols w:space="708"/>
@@ -7577,6 +7829,16 @@
 </file>
 
 <file path=word/footer1.xml><?xml version="1.0" encoding="utf-8"?>
+<w:ftr xmlns:wpc="http://schemas.microsoft.com/office/word/2010/wordprocessingCanvas" xmlns:cx="http://schemas.microsoft.com/office/drawing/2014/chartex" xmlns:cx1="http://schemas.microsoft.com/office/drawing/2015/9/8/chartex" xmlns:cx2="http://schemas.microsoft.com/office/drawing/2015/10/21/chartex" xmlns:cx3="http://schemas.microsoft.com/office/drawing/2016/5/9/chartex" xmlns:cx4="http://schemas.microsoft.com/office/drawing/2016/5/10/chartex" xmlns:cx5="http://schemas.microsoft.com/office/drawing/2016/5/11/chartex" xmlns:cx6="http://schemas.microsoft.com/office/drawing/2016/5/12/chartex" xmlns:cx7="http://schemas.microsoft.com/office/drawing/2016/5/13/chartex" xmlns:cx8="http://schemas.microsoft.com/office/drawing/2016/5/14/chartex" xmlns:mc="http://schemas.openxmlformats.org/markup-compatibility/2006" xmlns:aink="http://schemas.microsoft.com/office/drawing/2016/ink" xmlns:am3d="http://schemas.microsoft.com/office/drawing/2017/model3d" xmlns:o="urn:schemas-microsoft-com:office:office" xmlns:oel="http://schemas.microsoft.com/office/2019/extlst" xmlns:r="http://schemas.openxmlformats.org/officeDocument/2006/relationships" xmlns:m="http://schemas.openxmlformats.org/officeDocument/2006/math" xmlns:v="urn:schemas-microsoft-com:vml" xmlns:wp14="http://schemas.microsoft.com/office/word/2010/wordprocessingDrawing" xmlns:wp="http://schemas.openxmlformats.org/drawingml/2006/wordprocessingDrawing" xmlns:w10="urn:schemas-microsoft-com:office:word" xmlns:w="http://schemas.openxmlformats.org/wordprocessingml/2006/main" xmlns:w14="http://schemas.microsoft.com/office/word/2010/wordml" xmlns:w15="http://schemas.microsoft.com/office/word/2012/wordml" xmlns:w16cex="http://schemas.microsoft.com/office/word/2018/wordml/cex" xmlns:w16cid="http://schemas.microsoft.com/office/word/2016/wordml/cid" xmlns:w16="http://schemas.microsoft.com/office/word/2018/wordml" xmlns:w16du="http://schemas.microsoft.com/office/word/2023/wordml/word16du" xmlns:w16sdtdh="http://schemas.microsoft.com/office/word/2020/wordml/sdtdatahash" xmlns:w16sdtfl="http://schemas.microsoft.com/office/word/2024/wordml/sdtformatlock" xmlns:w16se="http://schemas.microsoft.com/office/word/2015/wordml/symex" xmlns:wpg="http://schemas.microsoft.com/office/word/2010/wordprocessingGroup" xmlns:wpi="http://schemas.microsoft.com/office/word/2010/wordprocessingInk" xmlns:wne="http://schemas.microsoft.com/office/word/2006/wordml" xmlns:wps="http://schemas.microsoft.com/office/word/2010/wordprocessingShape" mc:Ignorable="w14 w15 w16se w16cid w16 w16cex w16sdtdh w16sdtfl w16du wp14">
+  <w:p>
+    <w:pPr>
+      <w:pStyle w:val="AltBilgi"/>
+    </w:pPr>
+  </w:p>
+</w:ftr>
+</file>
+
+<file path=word/footer2.xml><?xml version="1.0" encoding="utf-8"?>
 <w:ftr xmlns:wpc="http://schemas.microsoft.com/office/word/2010/wordprocessingCanvas" xmlns:cx="http://schemas.microsoft.com/office/drawing/2014/chartex" xmlns:cx1="http://schemas.microsoft.com/office/drawing/2015/9/8/chartex" xmlns:cx2="http://schemas.microsoft.com/office/drawing/2015/10/21/chartex" xmlns:cx3="http://schemas.microsoft.com/office/drawing/2016/5/9/chartex" xmlns:cx4="http://schemas.microsoft.com/office/drawing/2016/5/10/chartex" xmlns:cx5="http://schemas.microsoft.com/office/drawing/2016/5/11/chartex" xmlns:cx6="http://schemas.microsoft.com/office/drawing/2016/5/12/chartex" xmlns:cx7="http://schemas.microsoft.com/office/drawing/2016/5/13/chartex" xmlns:cx8="http://schemas.microsoft.com/office/drawing/2016/5/14/chartex" xmlns:mc="http://schemas.openxmlformats.org/markup-compatibility/2006" xmlns:aink="http://schemas.microsoft.com/office/drawing/2016/ink" xmlns:am3d="http://schemas.microsoft.com/office/drawing/2017/model3d" xmlns:o="urn:schemas-microsoft-com:office:office" xmlns:oel="http://schemas.microsoft.com/office/2019/extlst" xmlns:r="http://schemas.openxmlformats.org/officeDocument/2006/relationships" xmlns:m="http://schemas.openxmlformats.org/officeDocument/2006/math" xmlns:v="urn:schemas-microsoft-com:vml" xmlns:wp14="http://schemas.microsoft.com/office/word/2010/wordprocessingDrawing" xmlns:wp="http://schemas.openxmlformats.org/drawingml/2006/wordprocessingDrawing" xmlns:w10="urn:schemas-microsoft-com:office:word" xmlns:w="http://schemas.openxmlformats.org/wordprocessingml/2006/main" xmlns:w14="http://schemas.microsoft.com/office/word/2010/wordml" xmlns:w15="http://schemas.microsoft.com/office/word/2012/wordml" xmlns:w16cex="http://schemas.microsoft.com/office/word/2018/wordml/cex" xmlns:w16cid="http://schemas.microsoft.com/office/word/2016/wordml/cid" xmlns:w16="http://schemas.microsoft.com/office/word/2018/wordml" xmlns:w16du="http://schemas.microsoft.com/office/word/2023/wordml/word16du" xmlns:w16sdtdh="http://schemas.microsoft.com/office/word/2020/wordml/sdtdatahash" xmlns:w16sdtfl="http://schemas.microsoft.com/office/word/2024/wordml/sdtformatlock" xmlns:w16se="http://schemas.microsoft.com/office/word/2015/wordml/symex" xmlns:wpg="http://schemas.microsoft.com/office/word/2010/wordprocessingGroup" xmlns:wpi="http://schemas.microsoft.com/office/word/2010/wordprocessingInk" xmlns:wne="http://schemas.microsoft.com/office/word/2006/wordml" xmlns:wps="http://schemas.microsoft.com/office/word/2010/wordprocessingShape" mc:Ignorable="w14 w15 w16se w16cid w16 w16cex w16sdtdh w16sdtfl w16du wp14">
   <w:sdt>
     <w:sdtPr>
@@ -7722,7 +7984,16 @@
                 <w:sz w:val="24"/>
                 <w:szCs w:val="24"/>
               </w:rPr>
-              <w:t>{{ firma</w:t>
+              <w:t xml:space="preserve">{{ </w:t>
+            </w:r>
+            <w:proofErr w:type="spellStart"/>
+            <w:r>
+              <w:rPr>
+                <w:rFonts w:ascii="Times-Roman" w:hAnsi="Times-Roman" w:cs="Times-Roman"/>
+                <w:sz w:val="24"/>
+                <w:szCs w:val="24"/>
+              </w:rPr>
+              <w:t>firma</w:t>
             </w:r>
             <w:proofErr w:type="gramEnd"/>
             <w:r>
@@ -7731,7 +8002,16 @@
                 <w:sz w:val="24"/>
                 <w:szCs w:val="24"/>
               </w:rPr>
-              <w:t>_adi }}</w:t>
+              <w:t>_adi</w:t>
+            </w:r>
+            <w:proofErr w:type="spellEnd"/>
+            <w:r>
+              <w:rPr>
+                <w:rFonts w:ascii="Times-Roman" w:hAnsi="Times-Roman" w:cs="Times-Roman"/>
+                <w:sz w:val="24"/>
+                <w:szCs w:val="24"/>
+              </w:rPr>
+              <w:t xml:space="preserve"> }}</w:t>
             </w:r>
           </w:p>
         </w:sdtContent>
@@ -7751,6 +8031,16 @@
 </w:ftr>
 </file>
 
+<file path=word/footer3.xml><?xml version="1.0" encoding="utf-8"?>
+<w:ftr xmlns:wpc="http://schemas.microsoft.com/office/word/2010/wordprocessingCanvas" xmlns:cx="http://schemas.microsoft.com/office/drawing/2014/chartex" xmlns:cx1="http://schemas.microsoft.com/office/drawing/2015/9/8/chartex" xmlns:cx2="http://schemas.microsoft.com/office/drawing/2015/10/21/chartex" xmlns:cx3="http://schemas.microsoft.com/office/drawing/2016/5/9/chartex" xmlns:cx4="http://schemas.microsoft.com/office/drawing/2016/5/10/chartex" xmlns:cx5="http://schemas.microsoft.com/office/drawing/2016/5/11/chartex" xmlns:cx6="http://schemas.microsoft.com/office/drawing/2016/5/12/chartex" xmlns:cx7="http://schemas.microsoft.com/office/drawing/2016/5/13/chartex" xmlns:cx8="http://schemas.microsoft.com/office/drawing/2016/5/14/chartex" xmlns:mc="http://schemas.openxmlformats.org/markup-compatibility/2006" xmlns:aink="http://schemas.microsoft.com/office/drawing/2016/ink" xmlns:am3d="http://schemas.microsoft.com/office/drawing/2017/model3d" xmlns:o="urn:schemas-microsoft-com:office:office" xmlns:oel="http://schemas.microsoft.com/office/2019/extlst" xmlns:r="http://schemas.openxmlformats.org/officeDocument/2006/relationships" xmlns:m="http://schemas.openxmlformats.org/officeDocument/2006/math" xmlns:v="urn:schemas-microsoft-com:vml" xmlns:wp14="http://schemas.microsoft.com/office/word/2010/wordprocessingDrawing" xmlns:wp="http://schemas.openxmlformats.org/drawingml/2006/wordprocessingDrawing" xmlns:w10="urn:schemas-microsoft-com:office:word" xmlns:w="http://schemas.openxmlformats.org/wordprocessingml/2006/main" xmlns:w14="http://schemas.microsoft.com/office/word/2010/wordml" xmlns:w15="http://schemas.microsoft.com/office/word/2012/wordml" xmlns:w16cex="http://schemas.microsoft.com/office/word/2018/wordml/cex" xmlns:w16cid="http://schemas.microsoft.com/office/word/2016/wordml/cid" xmlns:w16="http://schemas.microsoft.com/office/word/2018/wordml" xmlns:w16du="http://schemas.microsoft.com/office/word/2023/wordml/word16du" xmlns:w16sdtdh="http://schemas.microsoft.com/office/word/2020/wordml/sdtdatahash" xmlns:w16sdtfl="http://schemas.microsoft.com/office/word/2024/wordml/sdtformatlock" xmlns:w16se="http://schemas.microsoft.com/office/word/2015/wordml/symex" xmlns:wpg="http://schemas.microsoft.com/office/word/2010/wordprocessingGroup" xmlns:wpi="http://schemas.microsoft.com/office/word/2010/wordprocessingInk" xmlns:wne="http://schemas.microsoft.com/office/word/2006/wordml" xmlns:wps="http://schemas.microsoft.com/office/word/2010/wordprocessingShape" mc:Ignorable="w14 w15 w16se w16cid w16 w16cex w16sdtdh w16sdtfl w16du wp14">
+  <w:p>
+    <w:pPr>
+      <w:pStyle w:val="AltBilgi"/>
+    </w:pPr>
+  </w:p>
+</w:ftr>
+</file>
+
 <file path=word/footnotes.xml><?xml version="1.0" encoding="utf-8"?>
 <w:footnotes xmlns:wpc="http://schemas.microsoft.com/office/word/2010/wordprocessingCanvas" xmlns:cx="http://schemas.microsoft.com/office/drawing/2014/chartex" xmlns:cx1="http://schemas.microsoft.com/office/drawing/2015/9/8/chartex" xmlns:cx2="http://schemas.microsoft.com/office/drawing/2015/10/21/chartex" xmlns:cx3="http://schemas.microsoft.com/office/drawing/2016/5/9/chartex" xmlns:cx4="http://schemas.microsoft.com/office/drawing/2016/5/10/chartex" xmlns:cx5="http://schemas.microsoft.com/office/drawing/2016/5/11/chartex" xmlns:cx6="http://schemas.microsoft.com/office/drawing/2016/5/12/chartex" xmlns:cx7="http://schemas.microsoft.com/office/drawing/2016/5/13/chartex" xmlns:cx8="http://schemas.microsoft.com/office/drawing/2016/5/14/chartex" xmlns:mc="http://schemas.openxmlformats.org/markup-compatibility/2006" xmlns:aink="http://schemas.microsoft.com/office/drawing/2016/ink" xmlns:am3d="http://schemas.microsoft.com/office/drawing/2017/model3d" xmlns:o="urn:schemas-microsoft-com:office:office" xmlns:oel="http://schemas.microsoft.com/office/2019/extlst" xmlns:r="http://schemas.openxmlformats.org/officeDocument/2006/relationships" xmlns:m="http://schemas.openxmlformats.org/officeDocument/2006/math" xmlns:v="urn:schemas-microsoft-com:vml" xmlns:wp14="http://schemas.microsoft.com/office/word/2010/wordprocessingDrawing" xmlns:wp="http://schemas.openxmlformats.org/drawingml/2006/wordprocessingDrawing" xmlns:w10="urn:schemas-microsoft-com:office:word" xmlns:w="http://schemas.openxmlformats.org/wordprocessingml/2006/main" xmlns:w14="http://schemas.microsoft.com/office/word/2010/wordml" xmlns:w15="http://schemas.microsoft.com/office/word/2012/wordml" xmlns:w16cex="http://schemas.microsoft.com/office/word/2018/wordml/cex" xmlns:w16cid="http://schemas.microsoft.com/office/word/2016/wordml/cid" xmlns:w16="http://schemas.microsoft.com/office/word/2018/wordml" xmlns:w16du="http://schemas.microsoft.com/office/word/2023/wordml/word16du" xmlns:w16sdtdh="http://schemas.microsoft.com/office/word/2020/wordml/sdtdatahash" xmlns:w16sdtfl="http://schemas.microsoft.com/office/word/2024/wordml/sdtformatlock" xmlns:w16se="http://schemas.microsoft.com/office/word/2015/wordml/symex" xmlns:wpg="http://schemas.microsoft.com/office/word/2010/wordprocessingGroup" xmlns:wpi="http://schemas.microsoft.com/office/word/2010/wordprocessingInk" xmlns:wne="http://schemas.microsoft.com/office/word/2006/wordml" xmlns:wps="http://schemas.microsoft.com/office/word/2010/wordprocessingShape" mc:Ignorable="w14 w15 w16se w16cid w16 w16cex w16sdtdh w16sdtfl w16du wp14">
   <w:footnote w:type="separator" w:id="-1">
@@ -7777,6 +8067,16 @@
 </file>
 
 <file path=word/header1.xml><?xml version="1.0" encoding="utf-8"?>
+<w:hdr xmlns:wpc="http://schemas.microsoft.com/office/word/2010/wordprocessingCanvas" xmlns:cx="http://schemas.microsoft.com/office/drawing/2014/chartex" xmlns:cx1="http://schemas.microsoft.com/office/drawing/2015/9/8/chartex" xmlns:cx2="http://schemas.microsoft.com/office/drawing/2015/10/21/chartex" xmlns:cx3="http://schemas.microsoft.com/office/drawing/2016/5/9/chartex" xmlns:cx4="http://schemas.microsoft.com/office/drawing/2016/5/10/chartex" xmlns:cx5="http://schemas.microsoft.com/office/drawing/2016/5/11/chartex" xmlns:cx6="http://schemas.microsoft.com/office/drawing/2016/5/12/chartex" xmlns:cx7="http://schemas.microsoft.com/office/drawing/2016/5/13/chartex" xmlns:cx8="http://schemas.microsoft.com/office/drawing/2016/5/14/chartex" xmlns:mc="http://schemas.openxmlformats.org/markup-compatibility/2006" xmlns:aink="http://schemas.microsoft.com/office/drawing/2016/ink" xmlns:am3d="http://schemas.microsoft.com/office/drawing/2017/model3d" xmlns:o="urn:schemas-microsoft-com:office:office" xmlns:oel="http://schemas.microsoft.com/office/2019/extlst" xmlns:r="http://schemas.openxmlformats.org/officeDocument/2006/relationships" xmlns:m="http://schemas.openxmlformats.org/officeDocument/2006/math" xmlns:v="urn:schemas-microsoft-com:vml" xmlns:wp14="http://schemas.microsoft.com/office/word/2010/wordprocessingDrawing" xmlns:wp="http://schemas.openxmlformats.org/drawingml/2006/wordprocessingDrawing" xmlns:w10="urn:schemas-microsoft-com:office:word" xmlns:w="http://schemas.openxmlformats.org/wordprocessingml/2006/main" xmlns:w14="http://schemas.microsoft.com/office/word/2010/wordml" xmlns:w15="http://schemas.microsoft.com/office/word/2012/wordml" xmlns:w16cex="http://schemas.microsoft.com/office/word/2018/wordml/cex" xmlns:w16cid="http://schemas.microsoft.com/office/word/2016/wordml/cid" xmlns:w16="http://schemas.microsoft.com/office/word/2018/wordml" xmlns:w16du="http://schemas.microsoft.com/office/word/2023/wordml/word16du" xmlns:w16sdtdh="http://schemas.microsoft.com/office/word/2020/wordml/sdtdatahash" xmlns:w16sdtfl="http://schemas.microsoft.com/office/word/2024/wordml/sdtformatlock" xmlns:w16se="http://schemas.microsoft.com/office/word/2015/wordml/symex" xmlns:wpg="http://schemas.microsoft.com/office/word/2010/wordprocessingGroup" xmlns:wpi="http://schemas.microsoft.com/office/word/2010/wordprocessingInk" xmlns:wne="http://schemas.microsoft.com/office/word/2006/wordml" xmlns:wps="http://schemas.microsoft.com/office/word/2010/wordprocessingShape" mc:Ignorable="w14 w15 w16se w16cid w16 w16cex w16sdtdh w16sdtfl w16du wp14">
+  <w:p>
+    <w:pPr>
+      <w:pStyle w:val="stBilgi"/>
+    </w:pPr>
+  </w:p>
+</w:hdr>
+</file>
+
+<file path=word/header2.xml><?xml version="1.0" encoding="utf-8"?>
 <w:hdr xmlns:wpc="http://schemas.microsoft.com/office/word/2010/wordprocessingCanvas" xmlns:cx="http://schemas.microsoft.com/office/drawing/2014/chartex" xmlns:cx1="http://schemas.microsoft.com/office/drawing/2015/9/8/chartex" xmlns:cx2="http://schemas.microsoft.com/office/drawing/2015/10/21/chartex" xmlns:cx3="http://schemas.microsoft.com/office/drawing/2016/5/9/chartex" xmlns:cx4="http://schemas.microsoft.com/office/drawing/2016/5/10/chartex" xmlns:cx5="http://schemas.microsoft.com/office/drawing/2016/5/11/chartex" xmlns:cx6="http://schemas.microsoft.com/office/drawing/2016/5/12/chartex" xmlns:cx7="http://schemas.microsoft.com/office/drawing/2016/5/13/chartex" xmlns:cx8="http://schemas.microsoft.com/office/drawing/2016/5/14/chartex" xmlns:mc="http://schemas.openxmlformats.org/markup-compatibility/2006" xmlns:aink="http://schemas.microsoft.com/office/drawing/2016/ink" xmlns:am3d="http://schemas.microsoft.com/office/drawing/2017/model3d" xmlns:o="urn:schemas-microsoft-com:office:office" xmlns:oel="http://schemas.microsoft.com/office/2019/extlst" xmlns:r="http://schemas.openxmlformats.org/officeDocument/2006/relationships" xmlns:m="http://schemas.openxmlformats.org/officeDocument/2006/math" xmlns:v="urn:schemas-microsoft-com:vml" xmlns:wp14="http://schemas.microsoft.com/office/word/2010/wordprocessingDrawing" xmlns:wp="http://schemas.openxmlformats.org/drawingml/2006/wordprocessingDrawing" xmlns:w10="urn:schemas-microsoft-com:office:word" xmlns:w="http://schemas.openxmlformats.org/wordprocessingml/2006/main" xmlns:w14="http://schemas.microsoft.com/office/word/2010/wordml" xmlns:w15="http://schemas.microsoft.com/office/word/2012/wordml" xmlns:w16cex="http://schemas.microsoft.com/office/word/2018/wordml/cex" xmlns:w16cid="http://schemas.microsoft.com/office/word/2016/wordml/cid" xmlns:w16="http://schemas.microsoft.com/office/word/2018/wordml" xmlns:w16du="http://schemas.microsoft.com/office/word/2023/wordml/word16du" xmlns:w16sdtdh="http://schemas.microsoft.com/office/word/2020/wordml/sdtdatahash" xmlns:w16sdtfl="http://schemas.microsoft.com/office/word/2024/wordml/sdtformatlock" xmlns:w16se="http://schemas.microsoft.com/office/word/2015/wordml/symex" xmlns:wpg="http://schemas.microsoft.com/office/word/2010/wordprocessingGroup" xmlns:wpi="http://schemas.microsoft.com/office/word/2010/wordprocessingInk" xmlns:wne="http://schemas.microsoft.com/office/word/2006/wordml" xmlns:wps="http://schemas.microsoft.com/office/word/2010/wordprocessingShape" mc:Ignorable="w14 w15 w16se w16cid w16 w16cex w16sdtdh w16sdtfl w16du wp14">
   <w:p>
     <w:pPr>
@@ -7847,6 +8147,7 @@
       <w:spacing w:after="0" w:line="240" w:lineRule="auto"/>
       <w:rPr>
         <w:rFonts w:ascii="Times New Roman" w:hAnsi="Times New Roman" w:cs="Times New Roman"/>
+        <w:b/>
         <w:sz w:val="24"/>
       </w:rPr>
     </w:pPr>
@@ -7942,7 +8243,15 @@
         <w:rFonts w:ascii="Times New Roman" w:hAnsi="Times New Roman" w:cs="Times New Roman"/>
         <w:sz w:val="24"/>
       </w:rPr>
-      <w:t>{{ tarih</w:t>
+      <w:t xml:space="preserve">{{ </w:t>
+    </w:r>
+    <w:proofErr w:type="spellStart"/>
+    <w:r>
+      <w:rPr>
+        <w:rFonts w:ascii="Times New Roman" w:hAnsi="Times New Roman" w:cs="Times New Roman"/>
+        <w:sz w:val="24"/>
+      </w:rPr>
+      <w:t>ana</w:t>
     </w:r>
     <w:proofErr w:type="gramEnd"/>
     <w:r>
@@ -7950,18 +8259,32 @@
         <w:rFonts w:ascii="Times New Roman" w:hAnsi="Times New Roman" w:cs="Times New Roman"/>
         <w:sz w:val="24"/>
       </w:rPr>
-      <w:t xml:space="preserve"> }}</w:t>
+      <w:t>_sozlesme_baslangic_</w:t>
     </w:r>
-  </w:p>
-  <w:p>
-    <w:pPr>
-      <w:jc w:val="center"/>
+    <w:proofErr w:type="gramStart"/>
+    <w:r>
       <w:rPr>
         <w:rFonts w:ascii="Times New Roman" w:hAnsi="Times New Roman" w:cs="Times New Roman"/>
-        <w:b/>
         <w:sz w:val="24"/>
       </w:rPr>
-    </w:pPr>
+      <w:t>tarihi</w:t>
+    </w:r>
+    <w:proofErr w:type="spellEnd"/>
+    <w:r>
+      <w:rPr>
+        <w:rFonts w:ascii="Times New Roman" w:hAnsi="Times New Roman" w:cs="Times New Roman"/>
+        <w:sz w:val="24"/>
+      </w:rPr>
+      <w:t xml:space="preserve"> }</w:t>
+    </w:r>
+    <w:proofErr w:type="gramEnd"/>
+    <w:r>
+      <w:rPr>
+        <w:rFonts w:ascii="Times New Roman" w:hAnsi="Times New Roman" w:cs="Times New Roman"/>
+        <w:sz w:val="24"/>
+      </w:rPr>
+      <w:t>}</w:t>
+    </w:r>
   </w:p>
   <w:p>
     <w:pPr>
@@ -7975,6 +8298,16 @@
     <w:r>
       <w:tab/>
     </w:r>
+  </w:p>
+</w:hdr>
+</file>
+
+<file path=word/header3.xml><?xml version="1.0" encoding="utf-8"?>
+<w:hdr xmlns:wpc="http://schemas.microsoft.com/office/word/2010/wordprocessingCanvas" xmlns:cx="http://schemas.microsoft.com/office/drawing/2014/chartex" xmlns:cx1="http://schemas.microsoft.com/office/drawing/2015/9/8/chartex" xmlns:cx2="http://schemas.microsoft.com/office/drawing/2015/10/21/chartex" xmlns:cx3="http://schemas.microsoft.com/office/drawing/2016/5/9/chartex" xmlns:cx4="http://schemas.microsoft.com/office/drawing/2016/5/10/chartex" xmlns:cx5="http://schemas.microsoft.com/office/drawing/2016/5/11/chartex" xmlns:cx6="http://schemas.microsoft.com/office/drawing/2016/5/12/chartex" xmlns:cx7="http://schemas.microsoft.com/office/drawing/2016/5/13/chartex" xmlns:cx8="http://schemas.microsoft.com/office/drawing/2016/5/14/chartex" xmlns:mc="http://schemas.openxmlformats.org/markup-compatibility/2006" xmlns:aink="http://schemas.microsoft.com/office/drawing/2016/ink" xmlns:am3d="http://schemas.microsoft.com/office/drawing/2017/model3d" xmlns:o="urn:schemas-microsoft-com:office:office" xmlns:oel="http://schemas.microsoft.com/office/2019/extlst" xmlns:r="http://schemas.openxmlformats.org/officeDocument/2006/relationships" xmlns:m="http://schemas.openxmlformats.org/officeDocument/2006/math" xmlns:v="urn:schemas-microsoft-com:vml" xmlns:wp14="http://schemas.microsoft.com/office/word/2010/wordprocessingDrawing" xmlns:wp="http://schemas.openxmlformats.org/drawingml/2006/wordprocessingDrawing" xmlns:w10="urn:schemas-microsoft-com:office:word" xmlns:w="http://schemas.openxmlformats.org/wordprocessingml/2006/main" xmlns:w14="http://schemas.microsoft.com/office/word/2010/wordml" xmlns:w15="http://schemas.microsoft.com/office/word/2012/wordml" xmlns:w16cex="http://schemas.microsoft.com/office/word/2018/wordml/cex" xmlns:w16cid="http://schemas.microsoft.com/office/word/2016/wordml/cid" xmlns:w16="http://schemas.microsoft.com/office/word/2018/wordml" xmlns:w16du="http://schemas.microsoft.com/office/word/2023/wordml/word16du" xmlns:w16sdtdh="http://schemas.microsoft.com/office/word/2020/wordml/sdtdatahash" xmlns:w16sdtfl="http://schemas.microsoft.com/office/word/2024/wordml/sdtformatlock" xmlns:w16se="http://schemas.microsoft.com/office/word/2015/wordml/symex" xmlns:wpg="http://schemas.microsoft.com/office/word/2010/wordprocessingGroup" xmlns:wpi="http://schemas.microsoft.com/office/word/2010/wordprocessingInk" xmlns:wne="http://schemas.microsoft.com/office/word/2006/wordml" xmlns:wps="http://schemas.microsoft.com/office/word/2010/wordprocessingShape" mc:Ignorable="w14 w15 w16se w16cid w16 w16cex w16sdtdh w16sdtfl w16du wp14">
+  <w:p>
+    <w:pPr>
+      <w:pStyle w:val="stBilgi"/>
+    </w:pPr>
   </w:p>
 </w:hdr>
 </file>

</xml_diff>